<commit_message>
Updated files for Bert Tutorial
</commit_message>
<xml_diff>
--- a/DataMining_BERT_Tutorial.docx
+++ b/DataMining_BERT_Tutorial.docx
@@ -99,7 +99,7 @@
           <w:sz w:val="22"/>
           <w:szCs w:val="22"/>
         </w:rPr>
-        <w:t xml:space="preserve">This tutorial walks you through fine-tuning a BERT model to automatically score student essays on a scale of 1–6, using 3,000 real essays as training data. By the end you will have a trained model running on the iTiger GPU cluster with a QWK score of approximately 0.60, which represents substantial agreement with human graders.</w:t>
+        <w:t xml:space="preserve">This tutorial walks you through fine-tuning a BERT model to automatically score student essays on a scale of 1–6, using 3,000 real essays as training data. By the end you will have a trained model running on the iTiger GPU cluster with a QWK score of approximately 0.45 after 1 epoch. Running 3 epochs brings this up to ~0.60, which represents substantial agreement with human graders.</w:t>
       </w:r>
     </w:p>
     <w:p>
@@ -524,7 +524,7 @@
                 <w:sz w:val="20"/>
                 <w:szCs w:val="20"/>
               </w:rPr>
-              <w:t xml:space="preserve">~0.60 after 3 epochs (substantial agreement with human graders)</w:t>
+              <w:t xml:space="preserve">~0.45 after 1 epoch (run 3 epochs for ~0.60)</w:t>
             </w:r>
           </w:p>
         </w:tc>
@@ -1976,21 +1976,7 @@
                 <w:sz w:val="18"/>
                 <w:szCs w:val="18"/>
               </w:rPr>
-              <w:t xml:space="preserve">mkdir bert_essay</w:t>
-            </w:r>
-          </w:p>
-          <w:p>
-            <w:pPr>
-              <w:spacing w:after="0" w:before="0" w:line="276"/>
-            </w:pPr>
-            <w:r>
-              <w:rPr>
-                <w:rFonts w:ascii="Courier New" w:cs="Courier New" w:eastAsia="Courier New" w:hAnsi="Courier New"/>
-                <w:color w:val="1F1F1F"/>
-                <w:sz w:val="18"/>
-                <w:szCs w:val="18"/>
-              </w:rPr>
-              <w:t xml:space="preserve">cd bert_essay</w:t>
+              <w:t xml:space="preserve"># The project folder will be created by git clone in Step 3</w:t>
             </w:r>
           </w:p>
         </w:tc>
@@ -2014,7 +2000,7 @@
           <w:sz w:val="22"/>
           <w:szCs w:val="22"/>
         </w:rPr>
-        <w:t xml:space="preserve">Then open the folder in VS Code: Ctrl+Shift+P -&gt; "Open Folder" -&gt; /project/your_username/bert_essay</w:t>
+        <w:t xml:space="preserve">Navigate to your project directory. The project folder (Data-Mining-Bert-Tutorial) will be created automatically by git clone in Step 3.</w:t>
       </w:r>
     </w:p>
     <w:p>
@@ -2042,7 +2028,7 @@
           <w:sz w:val="32"/>
           <w:szCs w:val="32"/>
         </w:rPr>
-        <w:t xml:space="preserve">Step 3 - Upload Your Files</w:t>
+        <w:t xml:space="preserve">Step 3 - Clone the Project Files</w:t>
       </w:r>
     </w:p>
     <w:p>
@@ -2055,7 +2041,7 @@
           <w:sz w:val="22"/>
           <w:szCs w:val="22"/>
         </w:rPr>
-        <w:t xml:space="preserve">With VS Code connected to iTiger, drag and drop your project files into the Explorer panel:</w:t>
+        <w:t xml:space="preserve">Clone the project repository directly onto the cluster. This is faster and more reliable than drag-and-drop or SCP.</w:t>
       </w:r>
     </w:p>
     <w:p>
@@ -2110,91 +2096,77 @@
                 <w:sz w:val="18"/>
                 <w:szCs w:val="18"/>
               </w:rPr>
-              <w:t xml:space="preserve">bert_essay/</w:t>
-            </w:r>
-          </w:p>
-          <w:p>
-            <w:pPr>
-              <w:spacing w:after="0" w:before="0" w:line="276"/>
-            </w:pPr>
-            <w:r>
-              <w:rPr>
-                <w:rFonts w:ascii="Courier New" w:cs="Courier New" w:eastAsia="Courier New" w:hAnsi="Courier New"/>
-                <w:color w:val="1F1F1F"/>
-                <w:sz w:val="18"/>
-                <w:szCs w:val="18"/>
-              </w:rPr>
-              <w:t xml:space="preserve">|-- config.py</w:t>
-            </w:r>
-          </w:p>
-          <w:p>
-            <w:pPr>
-              <w:spacing w:after="0" w:before="0" w:line="276"/>
-            </w:pPr>
-            <w:r>
-              <w:rPr>
-                <w:rFonts w:ascii="Courier New" w:cs="Courier New" w:eastAsia="Courier New" w:hAnsi="Courier New"/>
-                <w:color w:val="1F1F1F"/>
-                <w:sz w:val="18"/>
-                <w:szCs w:val="18"/>
-              </w:rPr>
-              <w:t xml:space="preserve">|-- train.py</w:t>
-            </w:r>
-          </w:p>
-          <w:p>
-            <w:pPr>
-              <w:spacing w:after="0" w:before="0" w:line="276"/>
-            </w:pPr>
-            <w:r>
-              <w:rPr>
-                <w:rFonts w:ascii="Courier New" w:cs="Courier New" w:eastAsia="Courier New" w:hAnsi="Courier New"/>
-                <w:color w:val="1F1F1F"/>
-                <w:sz w:val="18"/>
-                <w:szCs w:val="18"/>
-              </w:rPr>
-              <w:t xml:space="preserve">|-- predict.py</w:t>
-            </w:r>
-          </w:p>
-          <w:p>
-            <w:pPr>
-              <w:spacing w:after="0" w:before="0" w:line="276"/>
-            </w:pPr>
-            <w:r>
-              <w:rPr>
-                <w:rFonts w:ascii="Courier New" w:cs="Courier New" w:eastAsia="Courier New" w:hAnsi="Courier New"/>
-                <w:color w:val="1F1F1F"/>
-                <w:sz w:val="18"/>
-                <w:szCs w:val="18"/>
-              </w:rPr>
-              <w:t xml:space="preserve">|-- requirements.txt</w:t>
-            </w:r>
-          </w:p>
-          <w:p>
-            <w:pPr>
-              <w:spacing w:after="0" w:before="0" w:line="276"/>
-            </w:pPr>
-            <w:r>
-              <w:rPr>
-                <w:rFonts w:ascii="Courier New" w:cs="Courier New" w:eastAsia="Courier New" w:hAnsi="Courier New"/>
-                <w:color w:val="1F1F1F"/>
-                <w:sz w:val="18"/>
-                <w:szCs w:val="18"/>
-              </w:rPr>
-              <w:t xml:space="preserve">|-- run_train.sh</w:t>
-            </w:r>
-          </w:p>
-          <w:p>
-            <w:pPr>
-              <w:spacing w:after="0" w:before="0" w:line="276"/>
-            </w:pPr>
-            <w:r>
-              <w:rPr>
-                <w:rFonts w:ascii="Courier New" w:cs="Courier New" w:eastAsia="Courier New" w:hAnsi="Courier New"/>
-                <w:color w:val="1F1F1F"/>
-                <w:sz w:val="18"/>
-                <w:szCs w:val="18"/>
-              </w:rPr>
-              <w:t xml:space="preserve">`-- essay.csv</w:t>
+              <w:t xml:space="preserve"># Make sure you are in your project directory first</w:t>
+            </w:r>
+          </w:p>
+          <w:p>
+            <w:pPr>
+              <w:spacing w:after="0" w:before="0" w:line="276"/>
+            </w:pPr>
+            <w:r>
+              <w:rPr>
+                <w:rFonts w:ascii="Courier New" w:cs="Courier New" w:eastAsia="Courier New" w:hAnsi="Courier New"/>
+                <w:color w:val="1F1F1F"/>
+                <w:sz w:val="18"/>
+                <w:szCs w:val="18"/>
+              </w:rPr>
+              <w:t xml:space="preserve">cd /project/your_username</w:t>
+            </w:r>
+          </w:p>
+          <w:p>
+            <w:pPr>
+              <w:spacing w:after="0" w:before="0" w:line="276"/>
+            </w:pPr>
+            <w:r>
+              <w:rPr>
+                <w:rFonts w:ascii="Courier New" w:cs="Courier New" w:eastAsia="Courier New" w:hAnsi="Courier New"/>
+                <w:color w:val="1F1F1F"/>
+                <w:sz w:val="18"/>
+                <w:szCs w:val="18"/>
+              </w:rPr>
+              <w:t xml:space="preserve"> </w:t>
+            </w:r>
+          </w:p>
+          <w:p>
+            <w:pPr>
+              <w:spacing w:after="0" w:before="0" w:line="276"/>
+            </w:pPr>
+            <w:r>
+              <w:rPr>
+                <w:rFonts w:ascii="Courier New" w:cs="Courier New" w:eastAsia="Courier New" w:hAnsi="Courier New"/>
+                <w:color w:val="1F1F1F"/>
+                <w:sz w:val="18"/>
+                <w:szCs w:val="18"/>
+              </w:rPr>
+              <w:t xml:space="preserve"># Clone the repository</w:t>
+            </w:r>
+          </w:p>
+          <w:p>
+            <w:pPr>
+              <w:spacing w:after="0" w:before="0" w:line="276"/>
+            </w:pPr>
+            <w:r>
+              <w:rPr>
+                <w:rFonts w:ascii="Courier New" w:cs="Courier New" w:eastAsia="Courier New" w:hAnsi="Courier New"/>
+                <w:color w:val="1F1F1F"/>
+                <w:sz w:val="18"/>
+                <w:szCs w:val="18"/>
+              </w:rPr>
+              <w:t xml:space="preserve">git clone https://github.com/sreganti0805/Data-Mining-Bert-Tutorial.git</w:t>
+            </w:r>
+          </w:p>
+          <w:p>
+            <w:pPr>
+              <w:spacing w:after="0" w:before="0" w:line="276"/>
+            </w:pPr>
+            <w:r>
+              <w:rPr>
+                <w:rFonts w:ascii="Courier New" w:cs="Courier New" w:eastAsia="Courier New" w:hAnsi="Courier New"/>
+                <w:color w:val="1F1F1F"/>
+                <w:sz w:val="18"/>
+                <w:szCs w:val="18"/>
+              </w:rPr>
+              <w:t xml:space="preserve">cd Data-Mining-Bert-Tutorial</w:t>
             </w:r>
           </w:p>
         </w:tc>
@@ -2202,14 +2174,6 @@
     </w:tbl>
     <w:p>
       <w:pPr>
-        <w:spacing w:after="0" w:before="40"/>
-      </w:pPr>
-      <w:r>
-        <w:t xml:space="preserve"/>
-      </w:r>
-    </w:p>
-    <w:p>
-      <w:pPr>
         <w:spacing w:after="60" w:before="60"/>
       </w:pPr>
       <w:r>
@@ -2218,7 +2182,7 @@
           <w:sz w:val="22"/>
           <w:szCs w:val="22"/>
         </w:rPr>
-        <w:t xml:space="preserve">Alternatively, use SCP from your local machine:</w:t>
+        <w:t xml:space="preserve">After cloning, your project directory should look like this:</w:t>
       </w:r>
     </w:p>
     <w:p>
@@ -2273,12 +2237,132 @@
                 <w:sz w:val="18"/>
                 <w:szCs w:val="18"/>
               </w:rPr>
-              <w:t xml:space="preserve">scp -r /path/to/local/bert_essay  your_username@itiger.memphis.edu:/project/your_username</w:t>
+              <w:t xml:space="preserve">Data-Mining-Bert-Tutorial/</w:t>
+            </w:r>
+          </w:p>
+          <w:p>
+            <w:pPr>
+              <w:spacing w:after="0" w:before="0" w:line="276"/>
+            </w:pPr>
+            <w:r>
+              <w:rPr>
+                <w:rFonts w:ascii="Courier New" w:cs="Courier New" w:eastAsia="Courier New" w:hAnsi="Courier New"/>
+                <w:color w:val="1F1F1F"/>
+                <w:sz w:val="18"/>
+                <w:szCs w:val="18"/>
+              </w:rPr>
+              <w:t xml:space="preserve">|-- config.py</w:t>
+            </w:r>
+          </w:p>
+          <w:p>
+            <w:pPr>
+              <w:spacing w:after="0" w:before="0" w:line="276"/>
+            </w:pPr>
+            <w:r>
+              <w:rPr>
+                <w:rFonts w:ascii="Courier New" w:cs="Courier New" w:eastAsia="Courier New" w:hAnsi="Courier New"/>
+                <w:color w:val="1F1F1F"/>
+                <w:sz w:val="18"/>
+                <w:szCs w:val="18"/>
+              </w:rPr>
+              <w:t xml:space="preserve">|-- train.py</w:t>
+            </w:r>
+          </w:p>
+          <w:p>
+            <w:pPr>
+              <w:spacing w:after="0" w:before="0" w:line="276"/>
+            </w:pPr>
+            <w:r>
+              <w:rPr>
+                <w:rFonts w:ascii="Courier New" w:cs="Courier New" w:eastAsia="Courier New" w:hAnsi="Courier New"/>
+                <w:color w:val="1F1F1F"/>
+                <w:sz w:val="18"/>
+                <w:szCs w:val="18"/>
+              </w:rPr>
+              <w:t xml:space="preserve">|-- predict.py</w:t>
+            </w:r>
+          </w:p>
+          <w:p>
+            <w:pPr>
+              <w:spacing w:after="0" w:before="0" w:line="276"/>
+            </w:pPr>
+            <w:r>
+              <w:rPr>
+                <w:rFonts w:ascii="Courier New" w:cs="Courier New" w:eastAsia="Courier New" w:hAnsi="Courier New"/>
+                <w:color w:val="1F1F1F"/>
+                <w:sz w:val="18"/>
+                <w:szCs w:val="18"/>
+              </w:rPr>
+              <w:t xml:space="preserve">|-- requirements.txt</w:t>
+            </w:r>
+          </w:p>
+          <w:p>
+            <w:pPr>
+              <w:spacing w:after="0" w:before="0" w:line="276"/>
+            </w:pPr>
+            <w:r>
+              <w:rPr>
+                <w:rFonts w:ascii="Courier New" w:cs="Courier New" w:eastAsia="Courier New" w:hAnsi="Courier New"/>
+                <w:color w:val="1F1F1F"/>
+                <w:sz w:val="18"/>
+                <w:szCs w:val="18"/>
+              </w:rPr>
+              <w:t xml:space="preserve">|-- run_train.sh</w:t>
+            </w:r>
+          </w:p>
+          <w:p>
+            <w:pPr>
+              <w:spacing w:after="0" w:before="0" w:line="276"/>
+            </w:pPr>
+            <w:r>
+              <w:rPr>
+                <w:rFonts w:ascii="Courier New" w:cs="Courier New" w:eastAsia="Courier New" w:hAnsi="Courier New"/>
+                <w:color w:val="1F1F1F"/>
+                <w:sz w:val="18"/>
+                <w:szCs w:val="18"/>
+              </w:rPr>
+              <w:t xml:space="preserve">`-- essay.csv</w:t>
             </w:r>
           </w:p>
         </w:tc>
       </w:tr>
     </w:tbl>
+    <w:p>
+      <w:pPr>
+        <w:spacing w:after="60" w:before="60"/>
+      </w:pPr>
+      <w:r>
+        <w:rPr>
+          <w:rFonts w:ascii="Arial" w:cs="Arial" w:eastAsia="Arial" w:hAnsi="Arial"/>
+          <w:sz w:val="22"/>
+          <w:szCs w:val="22"/>
+        </w:rPr>
+        <w:t xml:space="preserve">Then open this folder in VS Code: Ctrl+Shift+P → “Open Folder” → /project/your_username/Data-Mining-Bert-Tutorial</w:t>
+      </w:r>
+    </w:p>
+    <w:p>
+      <w:pPr>
+        <w:spacing w:after="60" w:before="60"/>
+      </w:pPr>
+      <w:r>
+        <w:rPr>
+          <w:rFonts w:ascii="Arial" w:cs="Arial" w:eastAsia="Arial" w:hAnsi="Arial"/>
+          <w:color w:val="7B3F00"/>
+          <w:sz w:val="22"/>
+          <w:szCs w:val="22"/>
+          <w:b/>
+        </w:rPr>
+        <w:t xml:space="preserve">Tip: </w:t>
+      </w:r>
+      <w:r>
+        <w:rPr>
+          <w:rFonts w:ascii="Arial" w:cs="Arial" w:eastAsia="Arial" w:hAnsi="Arial"/>
+          <w:sz w:val="22"/>
+          <w:szCs w:val="22"/>
+        </w:rPr>
+        <w:t xml:space="preserve">If you prefer, you can also upload files manually via VS Code drag-and-drop or from a local terminal using: scp -r /path/to/local/Data-Mining-Bert-Tutorial your_username@itiger.memphis.edu:/project/your_username</w:t>
+      </w:r>
+    </w:p>
     <w:p>
       <w:pPr>
         <w:spacing w:after="0" w:before="80"/>
@@ -2967,7 +3051,7 @@
                 <w:sz w:val="18"/>
                 <w:szCs w:val="18"/>
               </w:rPr>
-              <w:t xml:space="preserve">EPOCHS     = 3</w:t>
+              <w:t xml:space="preserve">EPOCHS     = 1</w:t>
             </w:r>
           </w:p>
           <w:p>
@@ -3198,7 +3282,7 @@
                 <w:sz w:val="18"/>
                 <w:szCs w:val="18"/>
               </w:rPr>
-              <w:t xml:space="preserve">#SBATCH --time=06:00:00</w:t>
+              <w:t xml:space="preserve">#SBATCH --time=02:00:00</w:t>
             </w:r>
           </w:p>
           <w:p>
@@ -3254,7 +3338,7 @@
                 <w:sz w:val="18"/>
                 <w:szCs w:val="18"/>
               </w:rPr>
-              <w:t xml:space="preserve">cd /project/your_username/bert_essay</w:t>
+              <w:t xml:space="preserve">cd /project/your_username/Data-Mining-Bert-Tutorial</w:t>
             </w:r>
           </w:p>
           <w:p>
@@ -3280,6 +3364,32 @@
       </w:pPr>
       <w:r>
         <w:t xml:space="preserve"/>
+      </w:r>
+    </w:p>
+    <w:p>
+      <w:pPr>
+        <w:spacing w:after="80" w:before="80"/>
+        <w:ind w:left="360"/>
+      </w:pPr>
+      <w:r>
+        <w:rPr>
+          <w:rFonts w:ascii="Arial" w:cs="Arial" w:eastAsia="Arial" w:hAnsi="Arial"/>
+          <w:b/>
+          <w:bCs/>
+          <w:color w:val="C55A11"/>
+          <w:sz w:val="20"/>
+          <w:szCs w:val="20"/>
+        </w:rPr>
+        <w:t xml:space="preserve">Warning: </w:t>
+      </w:r>
+      <w:r>
+        <w:rPr>
+          <w:rFonts w:ascii="Arial" w:cs="Arial" w:eastAsia="Arial" w:hAnsi="Arial"/>
+          <w:color w:val="C55A11"/>
+          <w:sz w:val="20"/>
+          <w:szCs w:val="20"/>
+        </w:rPr>
+        <w:t xml:space="preserve">The cloned run_train.sh contains hardcoded paths with “sreganti” as the username. Open the file in VS Code and replace every instance of “sreganti” with your own iTiger username before submitting.</w:t>
       </w:r>
     </w:p>
     <w:p>
@@ -3852,21 +3962,21 @@
                 <w:sz w:val="18"/>
                 <w:szCs w:val="18"/>
               </w:rPr>
-              <w:t xml:space="preserve">Starting epoch 1/3...</w:t>
-            </w:r>
-          </w:p>
-          <w:p>
-            <w:pPr>
-              <w:spacing w:after="0" w:before="0" w:line="276"/>
-            </w:pPr>
-            <w:r>
-              <w:rPr>
-                <w:rFonts w:ascii="Courier New" w:cs="Courier New" w:eastAsia="Courier New" w:hAnsi="Courier New"/>
-                <w:color w:val="1F1F1F"/>
-                <w:sz w:val="18"/>
-                <w:szCs w:val="18"/>
-              </w:rPr>
-              <w:t xml:space="preserve">Epoch 1/3 | Train Loss: 1.4077 | Val Loss: 1.3722 | Val Acc: 0.3844 | Val QWK: 0.3307</w:t>
+              <w:t xml:space="preserve">Starting epoch 1/1...</w:t>
+            </w:r>
+          </w:p>
+          <w:p>
+            <w:pPr>
+              <w:spacing w:after="0" w:before="0" w:line="276"/>
+            </w:pPr>
+            <w:r>
+              <w:rPr>
+                <w:rFonts w:ascii="Courier New" w:cs="Courier New" w:eastAsia="Courier New" w:hAnsi="Courier New"/>
+                <w:color w:val="1F1F1F"/>
+                <w:sz w:val="18"/>
+                <w:szCs w:val="18"/>
+              </w:rPr>
+              <w:t xml:space="preserve">Epoch 1/1 | Train Loss: 1.4077 | Val Loss: 1.3722 | Val Acc: 0.3844 | Val QWK: 0.3307</w:t>
             </w:r>
           </w:p>
           <w:p>
@@ -5311,7 +5421,7 @@
             <w:szCs w:val="18"/>
             <w:u w:val="single"/>
           </w:rPr>
-          <w:t xml:space="preserve">https://github.com/CUCHon/DM</w:t>
+          <w:t xml:space="preserve">https://github.com/sreganti0805/Data-Mining-Bert-Tutorial</w:t>
         </w:r>
       </w:hyperlink>
     </w:p>

</xml_diff>